<commit_message>
Deploying to gh-pages from @ Morrison-Lab/rme@aaeed52b4304843e6eb905694da058419cd9769c 🚀
</commit_message>
<xml_diff>
--- a/chapters/exam-formula-sheet-handout.docx
+++ b/chapters/exam-formula-sheet-handout.docx
@@ -18145,12 +18145,33 @@
       <w:pPr>
         <w:pStyle w:val="BodyText"/>
       </w:pPr>
+      <m:oMath>
+        <m:r>
+          <m:t>2</m:t>
+        </m:r>
+        <m:r>
+          <m:rPr>
+            <m:sty m:val="p"/>
+          </m:rPr>
+          <m:t>×</m:t>
+        </m:r>
+        <m:r>
+          <m:t>2</m:t>
+        </m:r>
+      </m:oMath>
       <w:r>
         <w:rPr>
           <w:b/>
           <w:bCs/>
         </w:rPr>
-        <w:t xml:space="preserve">2×2 table shortcut</w:t>
+        <w:t xml:space="preserve"> </w:t>
+      </w:r>
+      <w:r>
+        <w:rPr>
+          <w:b/>
+          <w:bCs/>
+        </w:rPr>
+        <w:t xml:space="preserve">table shortcut</w:t>
       </w:r>
       <w:r>
         <w:t xml:space="preserve"> </w:t>
@@ -18167,7 +18188,13 @@
         </w:r>
       </w:hyperlink>
       <w:r>
-        <w:t xml:space="preserve">; cell counts</w:t>
+        <w:t xml:space="preserve">;</w:t>
+      </w:r>
+      <w:r>
+        <w:t xml:space="preserve"> </w:t>
+      </w:r>
+      <w:r>
+        <w:t xml:space="preserve">cell counts</w:t>
       </w:r>
       <w:r>
         <w:t xml:space="preserve"> </w:t>
@@ -19501,7 +19528,13 @@
         </w:r>
       </w:hyperlink>
       <w:r>
-        <w:t xml:space="preserve">; for nested models with</w:t>
+        <w:t xml:space="preserve">;</w:t>
+      </w:r>
+      <w:r>
+        <w:t xml:space="preserve"> </w:t>
+      </w:r>
+      <w:r>
+        <w:t xml:space="preserve">for nested models with</w:t>
       </w:r>
       <w:r>
         <w:t xml:space="preserve"> </w:t>

</xml_diff>

<commit_message>
Deploying to gh-pages from @ Morrison-Lab/rme@fffa4ea22e42c309a696d86a5b6dbac425f3d2f2 🚀
</commit_message>
<xml_diff>
--- a/chapters/exam-formula-sheet-handout.docx
+++ b/chapters/exam-formula-sheet-handout.docx
@@ -6043,492 +6043,529 @@
     <w:tbl>
       <w:tblPr>
         <w:tblStyle w:val="Table"/>
-        <w:tblW w:type="pct" w:w="5000"/>
-        <w:tblLayout w:type="fixed"/>
+        <w:tblInd w:w="164" w:type="dxa"/>
+        <w:tblBorders>
+          <w:left w:val="single" w:sz="24" w:space="0" w:color="909090"/>
+        </w:tblBorders>
+        <w:tblCellMar>
+          <w:left w:w="0" w:type="dxa"/>
+          <w:right w:w="0" w:type="dxa"/>
+        </w:tblCellMar>
         <w:tblLook w:firstRow="0" w:lastRow="0" w:firstColumn="0" w:lastColumn="0" w:noHBand="0" w:noVBand="0" w:val="0000"/>
       </w:tblPr>
       <w:tblGrid>
         <w:gridCol w:w="7920"/>
       </w:tblGrid>
       <w:tr>
+        <w:trPr>
+          <w:cantSplit/>
+        </w:trPr>
         <w:tc>
-          <w:tcPr/>
-          <w:bookmarkStart w:id="48" w:name="fig-expit-logit-diagram-summary"/>
+          <w:tcPr>
+            <w:tcMar>
+              <w:left w:w="144" w:type="dxa"/>
+            </w:tcMar>
+          </w:tcPr>
           <w:p>
             <w:pPr>
-              <w:jc w:val="center"/>
-            </w:pPr>
-            <m:oMathPara>
-              <m:oMathParaPr>
-                <m:jc m:val="center"/>
-              </m:oMathParaPr>
-              <m:oMath>
-                <m:limLow>
-                  <m:e>
-                    <m:limLow>
-                      <m:e>
-                        <m:r>
-                          <m:t>π</m:t>
-                        </m:r>
-                      </m:e>
-                      <m:lim>
-                        <m:r>
-                          <m:rPr>
-                            <m:sty m:val="p"/>
-                          </m:rPr>
-                          <m:t>⏟</m:t>
-                        </m:r>
-                      </m:lim>
-                    </m:limLow>
-                  </m:e>
-                  <m:lim>
-                    <m:r>
-                      <m:rPr>
-                        <m:sty m:val="p"/>
-                      </m:rPr>
-                      <m:t>Pr</m:t>
-                    </m:r>
-                    <m:r>
-                      <m:t>​</m:t>
-                    </m:r>
-                    <m:d>
-                      <m:dPr>
-                        <m:begChr m:val="("/>
-                        <m:sepChr m:val=""/>
-                        <m:endChr m:val=")"/>
-                        <m:grow/>
-                      </m:dPr>
-                      <m:e>
-                        <m:r>
-                          <m:t>Y</m:t>
-                        </m:r>
-                        <m:r>
-                          <m:rPr>
-                            <m:sty m:val="p"/>
-                          </m:rPr>
-                          <m:t>=</m:t>
-                        </m:r>
-                        <m:r>
-                          <m:t>1</m:t>
-                        </m:r>
-                      </m:e>
-                    </m:d>
-                    <m:r>
-                      <m:t>​</m:t>
-                    </m:r>
-                  </m:lim>
-                </m:limLow>
-                <m:limUpp>
-                  <m:e>
-                    <m:groupChr>
-                      <m:groupChrPr>
-                        <m:chr m:val="⏞"/>
-                        <m:pos m:val="top"/>
-                        <m:vertJc m:val="bot"/>
-                      </m:groupChrPr>
-                      <m:e>
-                        <m:limLow>
-                          <m:e>
-                            <m:limLow>
-                              <m:e>
-                                <m:limLow>
-                                  <m:e>
-                                    <m:limUpp>
-                                      <m:e>
-                                        <m:r>
-                                          <m:rPr>
-                                            <m:sty m:val="p"/>
-                                          </m:rPr>
-                                          <m:t>→</m:t>
-                                        </m:r>
-                                      </m:e>
-                                      <m:lim>
-                                        <m:f>
-                                          <m:fPr>
-                                            <m:type m:val="bar"/>
-                                          </m:fPr>
-                                          <m:num>
-                                            <m:r>
-                                              <m:t>π</m:t>
-                                            </m:r>
-                                          </m:num>
-                                          <m:den>
-                                            <m:r>
-                                              <m:t>1</m:t>
-                                            </m:r>
-                                            <m:r>
-                                              <m:rPr>
-                                                <m:sty m:val="p"/>
-                                              </m:rPr>
-                                              <m:t>−</m:t>
-                                            </m:r>
-                                            <m:r>
-                                              <m:t>π</m:t>
-                                            </m:r>
-                                          </m:den>
-                                        </m:f>
-                                      </m:lim>
-                                    </m:limUpp>
-                                  </m:e>
-                                  <m:lim>
-                                    <m:limLow>
-                                      <m:e>
-                                        <m:limUpp>
-                                          <m:e>
-                                            <m:r>
-                                              <m:rPr>
-                                                <m:sty m:val="p"/>
-                                              </m:rPr>
-                                              <m:t>←</m:t>
-                                            </m:r>
-                                          </m:e>
-                                          <m:lim>
-                                            <m:r>
-                                              <m:t>​</m:t>
-                                            </m:r>
-                                          </m:lim>
-                                        </m:limUpp>
-                                      </m:e>
-                                      <m:lim>
-                                        <m:f>
-                                          <m:fPr>
-                                            <m:type m:val="bar"/>
-                                          </m:fPr>
-                                          <m:num>
-                                            <m:r>
-                                              <m:t>ω</m:t>
-                                            </m:r>
-                                          </m:num>
-                                          <m:den>
-                                            <m:r>
-                                              <m:t>1</m:t>
-                                            </m:r>
-                                            <m:r>
-                                              <m:rPr>
-                                                <m:sty m:val="p"/>
-                                              </m:rPr>
-                                              <m:t>+</m:t>
-                                            </m:r>
-                                            <m:r>
-                                              <m:t>ω</m:t>
-                                            </m:r>
-                                          </m:den>
-                                        </m:f>
-                                      </m:lim>
-                                    </m:limLow>
-                                  </m:lim>
-                                </m:limLow>
-                                <m:limLow>
-                                  <m:e>
-                                    <m:limLow>
-                                      <m:e>
-                                        <m:r>
-                                          <m:t>ω</m:t>
-                                        </m:r>
-                                      </m:e>
-                                      <m:lim>
-                                        <m:r>
-                                          <m:rPr>
-                                            <m:sty m:val="p"/>
-                                          </m:rPr>
-                                          <m:t>⏟</m:t>
-                                        </m:r>
-                                      </m:lim>
-                                    </m:limLow>
-                                  </m:e>
-                                  <m:lim>
-                                    <m:r>
-                                      <m:rPr>
-                                        <m:sty m:val="p"/>
-                                      </m:rPr>
-                                      <m:t>odds</m:t>
-                                    </m:r>
-                                    <m:r>
-                                      <m:t>​</m:t>
-                                    </m:r>
-                                    <m:d>
-                                      <m:dPr>
-                                        <m:begChr m:val="{"/>
-                                        <m:sepChr m:val=""/>
-                                        <m:endChr m:val="}"/>
-                                        <m:grow/>
-                                      </m:dPr>
-                                      <m:e>
-                                        <m:r>
-                                          <m:t>Y</m:t>
-                                        </m:r>
-                                        <m:r>
-                                          <m:rPr>
-                                            <m:sty m:val="p"/>
-                                          </m:rPr>
-                                          <m:t>=</m:t>
-                                        </m:r>
-                                        <m:r>
-                                          <m:t>1</m:t>
-                                        </m:r>
-                                      </m:e>
-                                    </m:d>
-                                    <m:r>
-                                      <m:t>​</m:t>
-                                    </m:r>
-                                  </m:lim>
-                                </m:limLow>
-                                <m:limLow>
-                                  <m:e>
-                                    <m:limUpp>
-                                      <m:e>
-                                        <m:r>
-                                          <m:rPr>
-                                            <m:sty m:val="p"/>
-                                          </m:rPr>
-                                          <m:t>→</m:t>
-                                        </m:r>
-                                      </m:e>
-                                      <m:lim>
-                                        <m:r>
-                                          <m:rPr>
-                                            <m:sty m:val="p"/>
-                                          </m:rPr>
-                                          <m:t>log</m:t>
-                                        </m:r>
-                                        <m:r>
-                                          <m:t>​</m:t>
-                                        </m:r>
-                                        <m:d>
-                                          <m:dPr>
-                                            <m:begChr m:val="{"/>
-                                            <m:sepChr m:val=""/>
-                                            <m:endChr m:val="}"/>
-                                            <m:grow/>
-                                          </m:dPr>
-                                          <m:e>
-                                            <m:r>
-                                              <m:t>ω</m:t>
-                                            </m:r>
-                                          </m:e>
-                                        </m:d>
-                                        <m:r>
-                                          <m:t>​</m:t>
-                                        </m:r>
-                                      </m:lim>
-                                    </m:limUpp>
-                                  </m:e>
-                                  <m:lim>
-                                    <m:limLow>
-                                      <m:e>
-                                        <m:limUpp>
-                                          <m:e>
-                                            <m:r>
-                                              <m:rPr>
-                                                <m:sty m:val="p"/>
-                                              </m:rPr>
-                                              <m:t>←</m:t>
-                                            </m:r>
-                                          </m:e>
-                                          <m:lim>
-                                            <m:r>
-                                              <m:t>​</m:t>
-                                            </m:r>
-                                          </m:lim>
-                                        </m:limUpp>
-                                      </m:e>
-                                      <m:lim>
-                                        <m:r>
-                                          <m:rPr>
-                                            <m:sty m:val="p"/>
-                                          </m:rPr>
-                                          <m:t>exp</m:t>
-                                        </m:r>
-                                        <m:r>
-                                          <m:t>​</m:t>
-                                        </m:r>
-                                        <m:d>
-                                          <m:dPr>
-                                            <m:begChr m:val="{"/>
-                                            <m:sepChr m:val=""/>
-                                            <m:endChr m:val="}"/>
-                                            <m:grow/>
-                                          </m:dPr>
-                                          <m:e>
-                                            <m:r>
-                                              <m:t>η</m:t>
-                                            </m:r>
-                                          </m:e>
-                                        </m:d>
-                                        <m:r>
-                                          <m:t>​</m:t>
-                                        </m:r>
-                                      </m:lim>
-                                    </m:limLow>
-                                  </m:lim>
-                                </m:limLow>
-                              </m:e>
-                              <m:lim>
-                                <m:r>
-                                  <m:rPr>
-                                    <m:sty m:val="p"/>
-                                  </m:rPr>
-                                  <m:t>⏟</m:t>
-                                </m:r>
-                              </m:lim>
-                            </m:limLow>
-                          </m:e>
-                          <m:lim>
-                            <m:r>
-                              <m:rPr>
-                                <m:sty m:val="p"/>
-                              </m:rPr>
-                              <m:t>expit</m:t>
-                            </m:r>
-                            <m:r>
-                              <m:t>​</m:t>
-                            </m:r>
-                            <m:d>
-                              <m:dPr>
-                                <m:begChr m:val="{"/>
-                                <m:sepChr m:val=""/>
-                                <m:endChr m:val="}"/>
-                                <m:grow/>
-                              </m:dPr>
-                              <m:e>
-                                <m:r>
-                                  <m:t>η</m:t>
-                                </m:r>
-                              </m:e>
-                            </m:d>
-                            <m:r>
-                              <m:t>​</m:t>
-                            </m:r>
-                          </m:lim>
-                        </m:limLow>
-                      </m:e>
-                    </m:groupChr>
-                  </m:e>
-                  <m:lim>
-                    <m:r>
-                      <m:rPr>
-                        <m:sty m:val="p"/>
-                      </m:rPr>
-                      <m:t>logit</m:t>
-                    </m:r>
-                    <m:r>
-                      <m:t>​</m:t>
-                    </m:r>
-                    <m:d>
-                      <m:dPr>
-                        <m:begChr m:val="{"/>
-                        <m:sepChr m:val=""/>
-                        <m:endChr m:val="}"/>
-                        <m:grow/>
-                      </m:dPr>
-                      <m:e>
-                        <m:r>
-                          <m:t>π</m:t>
-                        </m:r>
-                      </m:e>
-                    </m:d>
-                    <m:r>
-                      <m:t>​</m:t>
-                    </m:r>
-                  </m:lim>
-                </m:limUpp>
-                <m:limLow>
-                  <m:e>
-                    <m:limLow>
-                      <m:e>
-                        <m:r>
-                          <m:t>η</m:t>
-                        </m:r>
-                      </m:e>
-                      <m:lim>
-                        <m:r>
-                          <m:rPr>
-                            <m:sty m:val="p"/>
-                          </m:rPr>
-                          <m:t>⏟</m:t>
-                        </m:r>
-                      </m:lim>
-                    </m:limLow>
-                  </m:e>
-                  <m:lim>
-                    <m:r>
-                      <m:t>η</m:t>
-                    </m:r>
-                    <m:r>
-                      <m:t>​</m:t>
-                    </m:r>
-                    <m:d>
-                      <m:dPr>
-                        <m:begChr m:val="("/>
-                        <m:sepChr m:val=""/>
-                        <m:endChr m:val=")"/>
-                        <m:grow/>
-                      </m:dPr>
-                      <m:e>
-                        <m:r>
-                          <m:t>Y</m:t>
-                        </m:r>
-                        <m:r>
-                          <m:rPr>
-                            <m:sty m:val="p"/>
-                          </m:rPr>
-                          <m:t>=</m:t>
-                        </m:r>
-                        <m:r>
-                          <m:t>1</m:t>
-                        </m:r>
-                      </m:e>
-                    </m:d>
-                    <m:r>
-                      <m:t>​</m:t>
-                    </m:r>
-                  </m:lim>
-                </m:limLow>
-              </m:oMath>
-            </m:oMathPara>
-          </w:p>
-          <w:p>
-            <w:pPr>
-              <w:jc w:val="center"/>
+              <w:pStyle w:val="FirstParagraph"/>
             </w:pPr>
             <w:pPr>
-              <w:jc w:val="left"/>
-              <w:spacing w:before="200"/>
-              <w:pStyle w:val="ImageCaption"/>
+              <w:spacing w:before="16" w:after="64"/>
             </w:pPr>
-            <w:r>
-              <w:t xml:space="preserve">Figure 1: Diagram of</w:t>
-            </w:r>
-            <w:r>
-              <w:t xml:space="preserve"> </w:t>
-            </w:r>
-            <w:hyperlink r:id="rId46">
-              <w:r>
-                <w:rPr>
-                  <w:rStyle w:val="Hyperlink"/>
-                </w:rPr>
-                <w:t xml:space="preserve">logistic regression</w:t>
-              </w:r>
-            </w:hyperlink>
-            <w:r>
-              <w:t xml:space="preserve"> </w:t>
-            </w:r>
-            <w:r>
-              <w:t xml:space="preserve">link and inverse</w:t>
-            </w:r>
-            <w:r>
-              <w:t xml:space="preserve"> </w:t>
-            </w:r>
-            <w:hyperlink r:id="rId47">
-              <w:r>
-                <w:rPr>
-                  <w:rStyle w:val="Hyperlink"/>
-                </w:rPr>
-                <w:t xml:space="preserve">link functions</w:t>
-              </w:r>
-            </w:hyperlink>
           </w:p>
-          <w:bookmarkEnd w:id="48"/>
+          <w:tbl>
+            <w:tblPr>
+              <w:tblStyle w:val="Table"/>
+              <w:tblW w:type="pct" w:w="5000"/>
+              <w:tblLayout w:type="fixed"/>
+              <w:tblLook w:firstRow="0" w:lastRow="0" w:firstColumn="0" w:lastColumn="0" w:noHBand="0" w:noVBand="0" w:val="0000"/>
+            </w:tblPr>
+            <w:tblGrid>
+              <w:gridCol w:w="7920"/>
+            </w:tblGrid>
+            <w:tr>
+              <w:tc>
+                <w:tcPr/>
+                <w:bookmarkStart w:id="48" w:name="fig-expit-logit-diagram-summary"/>
+                <w:p>
+                  <w:pPr>
+                    <w:jc w:val="center"/>
+                  </w:pPr>
+                  <m:oMathPara>
+                    <m:oMathParaPr>
+                      <m:jc m:val="center"/>
+                    </m:oMathParaPr>
+                    <m:oMath>
+                      <m:limLow>
+                        <m:e>
+                          <m:limLow>
+                            <m:e>
+                              <m:r>
+                                <m:t>π</m:t>
+                              </m:r>
+                            </m:e>
+                            <m:lim>
+                              <m:r>
+                                <m:rPr>
+                                  <m:sty m:val="p"/>
+                                </m:rPr>
+                                <m:t>⏟</m:t>
+                              </m:r>
+                            </m:lim>
+                          </m:limLow>
+                        </m:e>
+                        <m:lim>
+                          <m:r>
+                            <m:rPr>
+                              <m:sty m:val="p"/>
+                            </m:rPr>
+                            <m:t>Pr</m:t>
+                          </m:r>
+                          <m:r>
+                            <m:t>​</m:t>
+                          </m:r>
+                          <m:d>
+                            <m:dPr>
+                              <m:begChr m:val="("/>
+                              <m:sepChr m:val=""/>
+                              <m:endChr m:val=")"/>
+                              <m:grow/>
+                            </m:dPr>
+                            <m:e>
+                              <m:r>
+                                <m:t>Y</m:t>
+                              </m:r>
+                              <m:r>
+                                <m:rPr>
+                                  <m:sty m:val="p"/>
+                                </m:rPr>
+                                <m:t>=</m:t>
+                              </m:r>
+                              <m:r>
+                                <m:t>1</m:t>
+                              </m:r>
+                            </m:e>
+                          </m:d>
+                          <m:r>
+                            <m:t>​</m:t>
+                          </m:r>
+                        </m:lim>
+                      </m:limLow>
+                      <m:limUpp>
+                        <m:e>
+                          <m:groupChr>
+                            <m:groupChrPr>
+                              <m:chr m:val="⏞"/>
+                              <m:pos m:val="top"/>
+                              <m:vertJc m:val="bot"/>
+                            </m:groupChrPr>
+                            <m:e>
+                              <m:limLow>
+                                <m:e>
+                                  <m:limLow>
+                                    <m:e>
+                                      <m:limLow>
+                                        <m:e>
+                                          <m:limUpp>
+                                            <m:e>
+                                              <m:r>
+                                                <m:rPr>
+                                                  <m:sty m:val="p"/>
+                                                </m:rPr>
+                                                <m:t>→</m:t>
+                                              </m:r>
+                                            </m:e>
+                                            <m:lim>
+                                              <m:f>
+                                                <m:fPr>
+                                                  <m:type m:val="bar"/>
+                                                </m:fPr>
+                                                <m:num>
+                                                  <m:r>
+                                                    <m:t>π</m:t>
+                                                  </m:r>
+                                                </m:num>
+                                                <m:den>
+                                                  <m:r>
+                                                    <m:t>1</m:t>
+                                                  </m:r>
+                                                  <m:r>
+                                                    <m:rPr>
+                                                      <m:sty m:val="p"/>
+                                                    </m:rPr>
+                                                    <m:t>−</m:t>
+                                                  </m:r>
+                                                  <m:r>
+                                                    <m:t>π</m:t>
+                                                  </m:r>
+                                                </m:den>
+                                              </m:f>
+                                            </m:lim>
+                                          </m:limUpp>
+                                        </m:e>
+                                        <m:lim>
+                                          <m:limLow>
+                                            <m:e>
+                                              <m:limUpp>
+                                                <m:e>
+                                                  <m:r>
+                                                    <m:rPr>
+                                                      <m:sty m:val="p"/>
+                                                    </m:rPr>
+                                                    <m:t>←</m:t>
+                                                  </m:r>
+                                                </m:e>
+                                                <m:lim>
+                                                  <m:r>
+                                                    <m:t>​</m:t>
+                                                  </m:r>
+                                                </m:lim>
+                                              </m:limUpp>
+                                            </m:e>
+                                            <m:lim>
+                                              <m:f>
+                                                <m:fPr>
+                                                  <m:type m:val="bar"/>
+                                                </m:fPr>
+                                                <m:num>
+                                                  <m:r>
+                                                    <m:t>ω</m:t>
+                                                  </m:r>
+                                                </m:num>
+                                                <m:den>
+                                                  <m:r>
+                                                    <m:t>1</m:t>
+                                                  </m:r>
+                                                  <m:r>
+                                                    <m:rPr>
+                                                      <m:sty m:val="p"/>
+                                                    </m:rPr>
+                                                    <m:t>+</m:t>
+                                                  </m:r>
+                                                  <m:r>
+                                                    <m:t>ω</m:t>
+                                                  </m:r>
+                                                </m:den>
+                                              </m:f>
+                                            </m:lim>
+                                          </m:limLow>
+                                        </m:lim>
+                                      </m:limLow>
+                                      <m:limLow>
+                                        <m:e>
+                                          <m:limLow>
+                                            <m:e>
+                                              <m:r>
+                                                <m:t>ω</m:t>
+                                              </m:r>
+                                            </m:e>
+                                            <m:lim>
+                                              <m:r>
+                                                <m:rPr>
+                                                  <m:sty m:val="p"/>
+                                                </m:rPr>
+                                                <m:t>⏟</m:t>
+                                              </m:r>
+                                            </m:lim>
+                                          </m:limLow>
+                                        </m:e>
+                                        <m:lim>
+                                          <m:r>
+                                            <m:rPr>
+                                              <m:sty m:val="p"/>
+                                            </m:rPr>
+                                            <m:t>odds</m:t>
+                                          </m:r>
+                                          <m:r>
+                                            <m:t>​</m:t>
+                                          </m:r>
+                                          <m:d>
+                                            <m:dPr>
+                                              <m:begChr m:val="{"/>
+                                              <m:sepChr m:val=""/>
+                                              <m:endChr m:val="}"/>
+                                              <m:grow/>
+                                            </m:dPr>
+                                            <m:e>
+                                              <m:r>
+                                                <m:t>Y</m:t>
+                                              </m:r>
+                                              <m:r>
+                                                <m:rPr>
+                                                  <m:sty m:val="p"/>
+                                                </m:rPr>
+                                                <m:t>=</m:t>
+                                              </m:r>
+                                              <m:r>
+                                                <m:t>1</m:t>
+                                              </m:r>
+                                            </m:e>
+                                          </m:d>
+                                          <m:r>
+                                            <m:t>​</m:t>
+                                          </m:r>
+                                        </m:lim>
+                                      </m:limLow>
+                                      <m:limLow>
+                                        <m:e>
+                                          <m:limUpp>
+                                            <m:e>
+                                              <m:r>
+                                                <m:rPr>
+                                                  <m:sty m:val="p"/>
+                                                </m:rPr>
+                                                <m:t>→</m:t>
+                                              </m:r>
+                                            </m:e>
+                                            <m:lim>
+                                              <m:r>
+                                                <m:rPr>
+                                                  <m:sty m:val="p"/>
+                                                </m:rPr>
+                                                <m:t>log</m:t>
+                                              </m:r>
+                                              <m:r>
+                                                <m:t>​</m:t>
+                                              </m:r>
+                                              <m:d>
+                                                <m:dPr>
+                                                  <m:begChr m:val="{"/>
+                                                  <m:sepChr m:val=""/>
+                                                  <m:endChr m:val="}"/>
+                                                  <m:grow/>
+                                                </m:dPr>
+                                                <m:e>
+                                                  <m:r>
+                                                    <m:t>ω</m:t>
+                                                  </m:r>
+                                                </m:e>
+                                              </m:d>
+                                              <m:r>
+                                                <m:t>​</m:t>
+                                              </m:r>
+                                            </m:lim>
+                                          </m:limUpp>
+                                        </m:e>
+                                        <m:lim>
+                                          <m:limLow>
+                                            <m:e>
+                                              <m:limUpp>
+                                                <m:e>
+                                                  <m:r>
+                                                    <m:rPr>
+                                                      <m:sty m:val="p"/>
+                                                    </m:rPr>
+                                                    <m:t>←</m:t>
+                                                  </m:r>
+                                                </m:e>
+                                                <m:lim>
+                                                  <m:r>
+                                                    <m:t>​</m:t>
+                                                  </m:r>
+                                                </m:lim>
+                                              </m:limUpp>
+                                            </m:e>
+                                            <m:lim>
+                                              <m:r>
+                                                <m:rPr>
+                                                  <m:sty m:val="p"/>
+                                                </m:rPr>
+                                                <m:t>exp</m:t>
+                                              </m:r>
+                                              <m:r>
+                                                <m:t>​</m:t>
+                                              </m:r>
+                                              <m:d>
+                                                <m:dPr>
+                                                  <m:begChr m:val="{"/>
+                                                  <m:sepChr m:val=""/>
+                                                  <m:endChr m:val="}"/>
+                                                  <m:grow/>
+                                                </m:dPr>
+                                                <m:e>
+                                                  <m:r>
+                                                    <m:t>η</m:t>
+                                                  </m:r>
+                                                </m:e>
+                                              </m:d>
+                                              <m:r>
+                                                <m:t>​</m:t>
+                                              </m:r>
+                                            </m:lim>
+                                          </m:limLow>
+                                        </m:lim>
+                                      </m:limLow>
+                                    </m:e>
+                                    <m:lim>
+                                      <m:r>
+                                        <m:rPr>
+                                          <m:sty m:val="p"/>
+                                        </m:rPr>
+                                        <m:t>⏟</m:t>
+                                      </m:r>
+                                    </m:lim>
+                                  </m:limLow>
+                                </m:e>
+                                <m:lim>
+                                  <m:r>
+                                    <m:rPr>
+                                      <m:sty m:val="p"/>
+                                    </m:rPr>
+                                    <m:t>expit</m:t>
+                                  </m:r>
+                                  <m:r>
+                                    <m:t>​</m:t>
+                                  </m:r>
+                                  <m:d>
+                                    <m:dPr>
+                                      <m:begChr m:val="{"/>
+                                      <m:sepChr m:val=""/>
+                                      <m:endChr m:val="}"/>
+                                      <m:grow/>
+                                    </m:dPr>
+                                    <m:e>
+                                      <m:r>
+                                        <m:t>η</m:t>
+                                      </m:r>
+                                    </m:e>
+                                  </m:d>
+                                  <m:r>
+                                    <m:t>​</m:t>
+                                  </m:r>
+                                </m:lim>
+                              </m:limLow>
+                            </m:e>
+                          </m:groupChr>
+                        </m:e>
+                        <m:lim>
+                          <m:r>
+                            <m:rPr>
+                              <m:sty m:val="p"/>
+                            </m:rPr>
+                            <m:t>logit</m:t>
+                          </m:r>
+                          <m:r>
+                            <m:t>​</m:t>
+                          </m:r>
+                          <m:d>
+                            <m:dPr>
+                              <m:begChr m:val="{"/>
+                              <m:sepChr m:val=""/>
+                              <m:endChr m:val="}"/>
+                              <m:grow/>
+                            </m:dPr>
+                            <m:e>
+                              <m:r>
+                                <m:t>π</m:t>
+                              </m:r>
+                            </m:e>
+                          </m:d>
+                          <m:r>
+                            <m:t>​</m:t>
+                          </m:r>
+                        </m:lim>
+                      </m:limUpp>
+                      <m:limLow>
+                        <m:e>
+                          <m:limLow>
+                            <m:e>
+                              <m:r>
+                                <m:t>η</m:t>
+                              </m:r>
+                            </m:e>
+                            <m:lim>
+                              <m:r>
+                                <m:rPr>
+                                  <m:sty m:val="p"/>
+                                </m:rPr>
+                                <m:t>⏟</m:t>
+                              </m:r>
+                            </m:lim>
+                          </m:limLow>
+                        </m:e>
+                        <m:lim>
+                          <m:r>
+                            <m:t>η</m:t>
+                          </m:r>
+                          <m:r>
+                            <m:t>​</m:t>
+                          </m:r>
+                          <m:d>
+                            <m:dPr>
+                              <m:begChr m:val="("/>
+                              <m:sepChr m:val=""/>
+                              <m:endChr m:val=")"/>
+                              <m:grow/>
+                            </m:dPr>
+                            <m:e>
+                              <m:r>
+                                <m:t>Y</m:t>
+                              </m:r>
+                              <m:r>
+                                <m:rPr>
+                                  <m:sty m:val="p"/>
+                                </m:rPr>
+                                <m:t>=</m:t>
+                              </m:r>
+                              <m:r>
+                                <m:t>1</m:t>
+                              </m:r>
+                            </m:e>
+                          </m:d>
+                          <m:r>
+                            <m:t>​</m:t>
+                          </m:r>
+                        </m:lim>
+                      </m:limLow>
+                    </m:oMath>
+                  </m:oMathPara>
+                </w:p>
+                <w:p>
+                  <w:pPr>
+                    <w:jc w:val="center"/>
+                  </w:pPr>
+                  <w:pPr>
+                    <w:jc w:val="left"/>
+                    <w:spacing w:before="200"/>
+                    <w:pStyle w:val="ImageCaption"/>
+                  </w:pPr>
+                  <w:r>
+                    <w:t xml:space="preserve">Figure 1: Diagram of</w:t>
+                  </w:r>
+                  <w:r>
+                    <w:t xml:space="preserve"> </w:t>
+                  </w:r>
+                  <w:hyperlink r:id="rId46">
+                    <w:r>
+                      <w:rPr>
+                        <w:rStyle w:val="Hyperlink"/>
+                      </w:rPr>
+                      <w:t xml:space="preserve">logistic regression</w:t>
+                    </w:r>
+                  </w:hyperlink>
+                  <w:r>
+                    <w:t xml:space="preserve"> </w:t>
+                  </w:r>
+                  <w:r>
+                    <w:t xml:space="preserve">link and inverse</w:t>
+                  </w:r>
+                  <w:r>
+                    <w:t xml:space="preserve"> </w:t>
+                  </w:r>
+                  <w:hyperlink r:id="rId47">
+                    <w:r>
+                      <w:rPr>
+                        <w:rStyle w:val="Hyperlink"/>
+                      </w:rPr>
+                      <w:t xml:space="preserve">link functions</w:t>
+                    </w:r>
+                  </w:hyperlink>
+                </w:p>
+                <w:bookmarkEnd w:id="48"/>
+              </w:tc>
+            </w:tr>
+          </w:tbl>
         </w:tc>
       </w:tr>
     </w:tbl>
@@ -16926,877 +16963,914 @@
     <w:tbl>
       <w:tblPr>
         <w:tblStyle w:val="Table"/>
-        <w:tblW w:type="pct" w:w="5000"/>
-        <w:tblLayout w:type="fixed"/>
+        <w:tblInd w:w="164" w:type="dxa"/>
+        <w:tblBorders>
+          <w:left w:val="single" w:sz="24" w:space="0" w:color="909090"/>
+        </w:tblBorders>
+        <w:tblCellMar>
+          <w:left w:w="0" w:type="dxa"/>
+          <w:right w:w="0" w:type="dxa"/>
+        </w:tblCellMar>
         <w:tblLook w:firstRow="0" w:lastRow="0" w:firstColumn="0" w:lastColumn="0" w:noHBand="0" w:noVBand="0" w:val="0000"/>
       </w:tblPr>
       <w:tblGrid>
         <w:gridCol w:w="7920"/>
       </w:tblGrid>
       <w:tr>
+        <w:trPr>
+          <w:cantSplit/>
+        </w:trPr>
         <w:tc>
-          <w:tcPr/>
-          <w:bookmarkStart w:id="157" w:name="tbl-prob-dist-fns"/>
+          <w:tcPr>
+            <w:tcMar>
+              <w:left w:w="144" w:type="dxa"/>
+            </w:tcMar>
+          </w:tcPr>
           <w:p>
             <w:pPr>
-              <w:jc w:val="center"/>
+              <w:pStyle w:val="FirstParagraph"/>
             </w:pPr>
             <w:pPr>
-              <w:jc w:val="left"/>
-              <w:spacing w:before="200"/>
-              <w:pStyle w:val="ImageCaption"/>
+              <w:spacing w:before="16" w:after="64"/>
             </w:pPr>
-            <w:r>
-              <w:t xml:space="preserve">Table 1: Probability distribution functions</w:t>
-            </w:r>
           </w:p>
           <w:tbl>
             <w:tblPr>
               <w:tblStyle w:val="Table"/>
               <w:tblW w:type="pct" w:w="5000"/>
               <w:tblLayout w:type="fixed"/>
-              <w:tblLook w:firstRow="1" w:lastRow="0" w:firstColumn="0" w:lastColumn="0" w:noHBand="0" w:noVBand="0" w:val="0020"/>
+              <w:tblLook w:firstRow="0" w:lastRow="0" w:firstColumn="0" w:lastColumn="0" w:noHBand="0" w:noVBand="0" w:val="0000"/>
             </w:tblPr>
             <w:tblGrid>
-              <w:gridCol w:w="3832"/>
-              <w:gridCol w:w="1532"/>
-              <w:gridCol w:w="2554"/>
+              <w:gridCol w:w="7920"/>
             </w:tblGrid>
-            <w:tr>
-              <w:trPr>
-                <w:tblHeader w:val="on"/>
-              </w:trPr>
-              <w:tc>
-                <w:tcPr/>
-                <w:p>
-                  <w:pPr>
-                    <w:pStyle w:val="Compact"/>
-                    <w:jc w:val="left"/>
-                    <w:jc w:val="center"/>
-                  </w:pPr>
-                  <w:r>
-                    <w:t xml:space="preserve">Name</w:t>
-                  </w:r>
-                </w:p>
-              </w:tc>
-              <w:tc>
-                <w:tcPr/>
-                <w:p>
-                  <w:pPr>
-                    <w:pStyle w:val="Compact"/>
-                    <w:jc w:val="center"/>
-                  </w:pPr>
-                  <w:r>
-                    <w:t xml:space="preserve">Symbols</w:t>
-                  </w:r>
-                </w:p>
-              </w:tc>
-              <w:tc>
-                <w:tcPr/>
-                <w:p>
-                  <w:pPr>
-                    <w:pStyle w:val="Compact"/>
-                    <w:jc w:val="center"/>
-                  </w:pPr>
-                  <w:r>
-                    <w:t xml:space="preserve">Definition</w:t>
-                  </w:r>
-                </w:p>
-              </w:tc>
-            </w:tr>
             <w:tr>
               <w:tc>
                 <w:tcPr/>
+                <w:bookmarkStart w:id="157" w:name="tbl-prob-dist-fns"/>
                 <w:p>
                   <w:pPr>
-                    <w:pStyle w:val="Compact"/>
-                    <w:jc w:val="left"/>
                     <w:jc w:val="center"/>
                   </w:pPr>
-                  <w:hyperlink r:id="rId151">
-                    <w:r>
-                      <w:rPr>
-                        <w:rStyle w:val="Hyperlink"/>
-                      </w:rPr>
-                      <w:t xml:space="preserve">Probability density function (PDF)</w:t>
-                    </w:r>
-                  </w:hyperlink>
-                </w:p>
-              </w:tc>
-              <w:tc>
-                <w:tcPr/>
-                <w:p>
                   <w:pPr>
-                    <w:pStyle w:val="Compact"/>
-                    <w:jc w:val="center"/>
+                    <w:jc w:val="left"/>
+                    <w:spacing w:before="200"/>
+                    <w:pStyle w:val="ImageCaption"/>
                   </w:pPr>
-                  <m:oMath>
-                    <m:r>
-                      <m:rPr>
-                        <m:sty m:val="p"/>
-                      </m:rPr>
-                      <m:t>f</m:t>
-                    </m:r>
-                    <m:r>
-                      <m:rPr>
-                        <m:sty m:val="p"/>
-                      </m:rPr>
-                      <m:t>(</m:t>
-                    </m:r>
-                    <m:r>
-                      <m:t>t</m:t>
-                    </m:r>
-                    <m:r>
-                      <m:rPr>
-                        <m:sty m:val="p"/>
-                      </m:rPr>
-                      <m:t>)</m:t>
-                    </m:r>
-                    <m:r>
-                      <m:rPr>
-                        <m:sty m:val="p"/>
-                      </m:rPr>
-                      <m:t>,</m:t>
-                    </m:r>
-                    <m:r>
-                      <m:rPr>
-                        <m:sty m:val="p"/>
-                      </m:rPr>
-                      <m:t>p</m:t>
-                    </m:r>
-                    <m:r>
-                      <m:rPr>
-                        <m:sty m:val="p"/>
-                      </m:rPr>
-                      <m:t>(</m:t>
-                    </m:r>
-                    <m:r>
-                      <m:t>t</m:t>
-                    </m:r>
-                    <m:r>
-                      <m:rPr>
-                        <m:sty m:val="p"/>
-                      </m:rPr>
-                      <m:t>)</m:t>
-                    </m:r>
-                  </m:oMath>
                   <w:r>
-                    <w:t xml:space="preserve">​</w:t>
+                    <w:t xml:space="preserve">Table 1: Probability distribution functions</w:t>
                   </w:r>
                 </w:p>
-              </w:tc>
-              <w:tc>
-                <w:tcPr/>
-                <w:p>
-                  <w:pPr>
-                    <w:pStyle w:val="Compact"/>
-                    <w:jc w:val="center"/>
-                  </w:pPr>
-                  <m:oMath>
-                    <m:r>
-                      <m:rPr>
-                        <m:sty m:val="p"/>
-                      </m:rPr>
-                      <m:t>p</m:t>
-                    </m:r>
-                    <m:r>
-                      <m:rPr>
-                        <m:sty m:val="p"/>
-                      </m:rPr>
-                      <m:t>(</m:t>
-                    </m:r>
-                    <m:r>
-                      <m:t>T</m:t>
-                    </m:r>
-                    <m:r>
-                      <m:rPr>
-                        <m:sty m:val="p"/>
-                      </m:rPr>
-                      <m:t>=</m:t>
-                    </m:r>
-                    <m:r>
-                      <m:t>t</m:t>
-                    </m:r>
-                    <m:r>
-                      <m:rPr>
-                        <m:sty m:val="p"/>
-                      </m:rPr>
-                      <m:t>)</m:t>
-                    </m:r>
-                  </m:oMath>
-                  <w:r>
-                    <w:t xml:space="preserve">​</w:t>
-                  </w:r>
-                </w:p>
-              </w:tc>
-            </w:tr>
-            <w:tr>
-              <w:tc>
-                <w:tcPr/>
-                <w:p>
-                  <w:pPr>
-                    <w:pStyle w:val="Compact"/>
-                    <w:jc w:val="left"/>
-                    <w:jc w:val="center"/>
-                  </w:pPr>
-                  <w:hyperlink r:id="rId152">
-                    <w:r>
-                      <w:rPr>
-                        <w:rStyle w:val="Hyperlink"/>
-                      </w:rPr>
-                      <w:t xml:space="preserve">Cumulative distribution function (CDF)</w:t>
-                    </w:r>
-                  </w:hyperlink>
-                </w:p>
-              </w:tc>
-              <w:tc>
-                <w:tcPr/>
-                <w:p>
-                  <w:pPr>
-                    <w:pStyle w:val="Compact"/>
-                    <w:jc w:val="center"/>
-                  </w:pPr>
-                  <m:oMath>
-                    <m:r>
-                      <m:rPr>
-                        <m:sty m:val="p"/>
-                      </m:rPr>
-                      <m:t>F</m:t>
-                    </m:r>
-                    <m:r>
-                      <m:rPr>
-                        <m:sty m:val="p"/>
-                      </m:rPr>
-                      <m:t>(</m:t>
-                    </m:r>
-                    <m:r>
-                      <m:t>t</m:t>
-                    </m:r>
-                    <m:r>
-                      <m:rPr>
-                        <m:sty m:val="p"/>
-                      </m:rPr>
-                      <m:t>)</m:t>
-                    </m:r>
-                    <m:r>
-                      <m:rPr>
-                        <m:sty m:val="p"/>
-                      </m:rPr>
-                      <m:t>,</m:t>
-                    </m:r>
-                    <m:r>
-                      <m:rPr>
-                        <m:sty m:val="p"/>
-                      </m:rPr>
-                      <m:t>P</m:t>
-                    </m:r>
-                    <m:r>
-                      <m:rPr>
-                        <m:sty m:val="p"/>
-                      </m:rPr>
-                      <m:t>(</m:t>
-                    </m:r>
-                    <m:r>
-                      <m:t>t</m:t>
-                    </m:r>
-                    <m:r>
-                      <m:rPr>
-                        <m:sty m:val="p"/>
-                      </m:rPr>
-                      <m:t>)</m:t>
-                    </m:r>
-                  </m:oMath>
-                  <w:r>
-                    <w:t xml:space="preserve">​</w:t>
-                  </w:r>
-                </w:p>
-              </w:tc>
-              <w:tc>
-                <w:tcPr/>
-                <w:p>
-                  <w:pPr>
-                    <w:pStyle w:val="Compact"/>
-                    <w:jc w:val="center"/>
-                  </w:pPr>
-                  <m:oMath>
-                    <m:r>
-                      <m:rPr>
-                        <m:sty m:val="p"/>
-                      </m:rPr>
-                      <m:t>P</m:t>
-                    </m:r>
-                    <m:r>
-                      <m:rPr>
-                        <m:sty m:val="p"/>
-                      </m:rPr>
-                      <m:t>(</m:t>
-                    </m:r>
-                    <m:r>
-                      <m:t>T</m:t>
-                    </m:r>
-                    <m:r>
-                      <m:rPr>
-                        <m:sty m:val="p"/>
-                      </m:rPr>
-                      <m:t>≤</m:t>
-                    </m:r>
-                    <m:r>
-                      <m:t>t</m:t>
-                    </m:r>
-                    <m:r>
-                      <m:rPr>
-                        <m:sty m:val="p"/>
-                      </m:rPr>
-                      <m:t>)</m:t>
-                    </m:r>
-                  </m:oMath>
-                  <w:r>
-                    <w:t xml:space="preserve">​</w:t>
-                  </w:r>
-                </w:p>
-              </w:tc>
-            </w:tr>
-            <w:tr>
-              <w:tc>
-                <w:tcPr/>
-                <w:p>
-                  <w:pPr>
-                    <w:pStyle w:val="Compact"/>
-                    <w:jc w:val="left"/>
-                    <w:jc w:val="center"/>
-                  </w:pPr>
-                  <w:hyperlink r:id="rId153">
-                    <w:r>
-                      <w:rPr>
-                        <w:rStyle w:val="Hyperlink"/>
-                      </w:rPr>
-                      <w:t xml:space="preserve">Survival function</w:t>
-                    </w:r>
-                  </w:hyperlink>
-                </w:p>
-              </w:tc>
-              <w:tc>
-                <w:tcPr/>
-                <w:p>
-                  <w:pPr>
-                    <w:pStyle w:val="Compact"/>
-                    <w:jc w:val="center"/>
-                  </w:pPr>
-                  <m:oMath>
-                    <m:r>
-                      <m:rPr>
-                        <m:sty m:val="p"/>
-                      </m:rPr>
-                      <m:t>S</m:t>
-                    </m:r>
-                    <m:r>
-                      <m:rPr>
-                        <m:sty m:val="p"/>
-                      </m:rPr>
-                      <m:t>(</m:t>
-                    </m:r>
-                    <m:r>
-                      <m:t>t</m:t>
-                    </m:r>
-                    <m:r>
-                      <m:rPr>
-                        <m:sty m:val="p"/>
-                      </m:rPr>
-                      <m:t>)</m:t>
-                    </m:r>
-                    <m:r>
-                      <m:rPr>
-                        <m:sty m:val="p"/>
-                      </m:rPr>
-                      <m:t>,</m:t>
-                    </m:r>
-                    <m:acc>
-                      <m:accPr>
-                        <m:chr m:val="‾"/>
-                      </m:accPr>
-                      <m:e>
-                        <m:r>
-                          <m:rPr>
-                            <m:sty m:val="p"/>
-                          </m:rPr>
-                          <m:t>F</m:t>
-                        </m:r>
-                      </m:e>
-                    </m:acc>
-                    <m:r>
-                      <m:rPr>
-                        <m:sty m:val="p"/>
-                      </m:rPr>
-                      <m:t>(</m:t>
-                    </m:r>
-                    <m:r>
-                      <m:t>t</m:t>
-                    </m:r>
-                    <m:r>
-                      <m:rPr>
-                        <m:sty m:val="p"/>
-                      </m:rPr>
-                      <m:t>)</m:t>
-                    </m:r>
-                  </m:oMath>
-                  <w:r>
-                    <w:t xml:space="preserve">​</w:t>
-                  </w:r>
-                </w:p>
-              </w:tc>
-              <w:tc>
-                <w:tcPr/>
-                <w:p>
-                  <w:pPr>
-                    <w:pStyle w:val="Compact"/>
-                    <w:jc w:val="center"/>
-                  </w:pPr>
-                  <m:oMath>
-                    <m:r>
-                      <m:rPr>
-                        <m:sty m:val="p"/>
-                      </m:rPr>
-                      <m:t>P</m:t>
-                    </m:r>
-                    <m:r>
-                      <m:rPr>
-                        <m:sty m:val="p"/>
-                      </m:rPr>
-                      <m:t>(</m:t>
-                    </m:r>
-                    <m:r>
-                      <m:t>T</m:t>
-                    </m:r>
-                    <m:r>
-                      <m:rPr>
-                        <m:sty m:val="p"/>
-                      </m:rPr>
-                      <m:t>&gt;</m:t>
-                    </m:r>
-                    <m:r>
-                      <m:t>t</m:t>
-                    </m:r>
-                    <m:r>
-                      <m:rPr>
-                        <m:sty m:val="p"/>
-                      </m:rPr>
-                      <m:t>)</m:t>
-                    </m:r>
-                  </m:oMath>
-                  <w:r>
-                    <w:t xml:space="preserve">​</w:t>
-                  </w:r>
-                </w:p>
-              </w:tc>
-            </w:tr>
-            <w:tr>
-              <w:tc>
-                <w:tcPr/>
-                <w:p>
-                  <w:pPr>
-                    <w:pStyle w:val="Compact"/>
-                    <w:jc w:val="left"/>
-                    <w:jc w:val="center"/>
-                  </w:pPr>
-                  <w:hyperlink r:id="rId154">
-                    <w:r>
-                      <w:rPr>
-                        <w:rStyle w:val="Hyperlink"/>
-                      </w:rPr>
-                      <w:t xml:space="preserve">Hazard function</w:t>
-                    </w:r>
-                  </w:hyperlink>
-                </w:p>
-              </w:tc>
-              <w:tc>
-                <w:tcPr/>
-                <w:p>
-                  <w:pPr>
-                    <w:pStyle w:val="Compact"/>
-                    <w:jc w:val="center"/>
-                  </w:pPr>
-                  <m:oMath>
-                    <m:r>
-                      <m:t>λ</m:t>
-                    </m:r>
-                    <m:r>
-                      <m:rPr>
-                        <m:sty m:val="p"/>
-                      </m:rPr>
-                      <m:t>(</m:t>
-                    </m:r>
-                    <m:r>
-                      <m:t>t</m:t>
-                    </m:r>
-                    <m:r>
-                      <m:rPr>
-                        <m:sty m:val="p"/>
-                      </m:rPr>
-                      <m:t>)</m:t>
-                    </m:r>
-                    <m:r>
-                      <m:rPr>
-                        <m:sty m:val="p"/>
-                      </m:rPr>
-                      <m:t>,</m:t>
-                    </m:r>
-                    <m:r>
-                      <m:rPr>
-                        <m:sty m:val="p"/>
-                      </m:rPr>
-                      <m:t>h</m:t>
-                    </m:r>
-                    <m:r>
-                      <m:rPr>
-                        <m:sty m:val="p"/>
-                      </m:rPr>
-                      <m:t>(</m:t>
-                    </m:r>
-                    <m:r>
-                      <m:t>t</m:t>
-                    </m:r>
-                    <m:r>
-                      <m:rPr>
-                        <m:sty m:val="p"/>
-                      </m:rPr>
-                      <m:t>)</m:t>
-                    </m:r>
-                  </m:oMath>
-                  <w:r>
-                    <w:t xml:space="preserve">​</w:t>
-                  </w:r>
-                </w:p>
-              </w:tc>
-              <w:tc>
-                <w:tcPr/>
-                <w:p>
-                  <w:pPr>
-                    <w:pStyle w:val="Compact"/>
-                    <w:jc w:val="center"/>
-                  </w:pPr>
-                  <m:oMath>
-                    <m:r>
-                      <m:rPr>
-                        <m:sty m:val="p"/>
-                      </m:rPr>
-                      <m:t>p</m:t>
-                    </m:r>
-                    <m:r>
-                      <m:rPr>
-                        <m:sty m:val="p"/>
-                      </m:rPr>
-                      <m:t>(</m:t>
-                    </m:r>
-                    <m:r>
-                      <m:t>T</m:t>
-                    </m:r>
-                    <m:r>
-                      <m:rPr>
-                        <m:sty m:val="p"/>
-                      </m:rPr>
-                      <m:t>=</m:t>
-                    </m:r>
-                    <m:r>
-                      <m:t>t</m:t>
-                    </m:r>
-                    <m:r>
-                      <m:rPr>
-                        <m:sty m:val="p"/>
-                      </m:rPr>
-                      <m:t>|</m:t>
-                    </m:r>
-                    <m:r>
-                      <m:t>T</m:t>
-                    </m:r>
-                    <m:r>
-                      <m:rPr>
-                        <m:sty m:val="p"/>
-                      </m:rPr>
-                      <m:t>≥</m:t>
-                    </m:r>
-                    <m:r>
-                      <m:t>t</m:t>
-                    </m:r>
-                    <m:r>
-                      <m:rPr>
-                        <m:sty m:val="p"/>
-                      </m:rPr>
-                      <m:t>)</m:t>
-                    </m:r>
-                  </m:oMath>
-                  <w:r>
-                    <w:t xml:space="preserve">​</w:t>
-                  </w:r>
-                </w:p>
-              </w:tc>
-            </w:tr>
-            <w:tr>
-              <w:tc>
-                <w:tcPr/>
-                <w:p>
-                  <w:pPr>
-                    <w:pStyle w:val="Compact"/>
-                    <w:jc w:val="left"/>
-                    <w:jc w:val="center"/>
-                  </w:pPr>
-                  <w:hyperlink r:id="rId155">
-                    <w:r>
-                      <w:rPr>
-                        <w:rStyle w:val="Hyperlink"/>
-                      </w:rPr>
-                      <w:t xml:space="preserve">Cumulative hazard function</w:t>
-                    </w:r>
-                  </w:hyperlink>
-                </w:p>
-              </w:tc>
-              <w:tc>
-                <w:tcPr/>
-                <w:p>
-                  <w:pPr>
-                    <w:pStyle w:val="Compact"/>
-                    <w:jc w:val="center"/>
-                  </w:pPr>
-                  <m:oMath>
-                    <m:r>
-                      <m:rPr>
-                        <m:sty m:val="p"/>
-                      </m:rPr>
-                      <m:t>Λ</m:t>
-                    </m:r>
-                    <m:r>
-                      <m:rPr>
-                        <m:sty m:val="p"/>
-                      </m:rPr>
-                      <m:t>(</m:t>
-                    </m:r>
-                    <m:r>
-                      <m:t>t</m:t>
-                    </m:r>
-                    <m:r>
-                      <m:rPr>
-                        <m:sty m:val="p"/>
-                      </m:rPr>
-                      <m:t>)</m:t>
-                    </m:r>
-                    <m:r>
-                      <m:rPr>
-                        <m:sty m:val="p"/>
-                      </m:rPr>
-                      <m:t>,</m:t>
-                    </m:r>
-                    <m:r>
-                      <m:rPr>
-                        <m:sty m:val="p"/>
-                      </m:rPr>
-                      <m:t>H</m:t>
-                    </m:r>
-                    <m:r>
-                      <m:rPr>
-                        <m:sty m:val="p"/>
-                      </m:rPr>
-                      <m:t>(</m:t>
-                    </m:r>
-                    <m:r>
-                      <m:t>t</m:t>
-                    </m:r>
-                    <m:r>
-                      <m:rPr>
-                        <m:sty m:val="p"/>
-                      </m:rPr>
-                      <m:t>)</m:t>
-                    </m:r>
-                  </m:oMath>
-                  <w:r>
-                    <w:t xml:space="preserve">​</w:t>
-                  </w:r>
-                </w:p>
-              </w:tc>
-              <w:tc>
-                <w:tcPr/>
-                <w:p>
-                  <w:pPr>
-                    <w:pStyle w:val="Compact"/>
-                    <w:jc w:val="center"/>
-                  </w:pPr>
-                  <m:oMath>
-                    <m:nary>
-                      <m:naryPr>
-                        <m:chr m:val="∫"/>
-                        <m:limLoc m:val="subSup"/>
-                        <m:subHide m:val="off"/>
-                        <m:supHide m:val="off"/>
-                      </m:naryPr>
-                      <m:sub>
-                        <m:r>
-                          <m:t>u</m:t>
-                        </m:r>
-                        <m:r>
-                          <m:rPr>
-                            <m:sty m:val="p"/>
-                          </m:rPr>
-                          <m:t>=</m:t>
-                        </m:r>
-                        <m:r>
-                          <m:rPr>
-                            <m:sty m:val="p"/>
-                          </m:rPr>
-                          <m:t>−</m:t>
-                        </m:r>
-                        <m:r>
-                          <m:rPr>
-                            <m:sty m:val="p"/>
-                          </m:rPr>
-                          <m:t>∞</m:t>
-                        </m:r>
-                      </m:sub>
-                      <m:sup>
-                        <m:r>
-                          <m:t>t</m:t>
-                        </m:r>
-                      </m:sup>
-                      <m:e>
-                        <m:r>
-                          <m:t>λ</m:t>
-                        </m:r>
-                      </m:e>
-                    </m:nary>
-                    <m:r>
-                      <m:rPr>
-                        <m:sty m:val="p"/>
-                      </m:rPr>
-                      <m:t>(</m:t>
-                    </m:r>
-                    <m:r>
-                      <m:t>u</m:t>
-                    </m:r>
-                    <m:r>
-                      <m:rPr>
-                        <m:sty m:val="p"/>
-                      </m:rPr>
-                      <m:t>)</m:t>
-                    </m:r>
-                    <m:r>
-                      <m:t>d</m:t>
-                    </m:r>
-                    <m:r>
-                      <m:t>u</m:t>
-                    </m:r>
-                  </m:oMath>
-                  <w:r>
-                    <w:t xml:space="preserve">​</w:t>
-                  </w:r>
-                </w:p>
-              </w:tc>
-            </w:tr>
-            <w:tr>
-              <w:tc>
-                <w:tcPr/>
-                <w:p>
-                  <w:pPr>
-                    <w:pStyle w:val="Compact"/>
-                    <w:jc w:val="left"/>
-                    <w:jc w:val="center"/>
-                  </w:pPr>
-                  <w:hyperlink r:id="rId156">
-                    <w:r>
-                      <w:rPr>
-                        <w:rStyle w:val="Hyperlink"/>
-                      </w:rPr>
-                      <w:t xml:space="preserve">Log-hazard function</w:t>
-                    </w:r>
-                  </w:hyperlink>
-                </w:p>
-              </w:tc>
-              <w:tc>
-                <w:tcPr/>
-                <w:p>
-                  <w:pPr>
-                    <w:pStyle w:val="Compact"/>
-                    <w:jc w:val="center"/>
-                  </w:pPr>
-                  <m:oMath>
-                    <m:r>
-                      <m:t>η</m:t>
-                    </m:r>
-                    <m:r>
-                      <m:rPr>
-                        <m:sty m:val="p"/>
-                      </m:rPr>
-                      <m:t>(</m:t>
-                    </m:r>
-                    <m:r>
-                      <m:t>t</m:t>
-                    </m:r>
-                    <m:r>
-                      <m:rPr>
-                        <m:sty m:val="p"/>
-                      </m:rPr>
-                      <m:t>)</m:t>
-                    </m:r>
-                  </m:oMath>
-                  <w:r>
-                    <w:t xml:space="preserve">​</w:t>
-                  </w:r>
-                </w:p>
-              </w:tc>
-              <w:tc>
-                <w:tcPr/>
-                <w:p>
-                  <w:pPr>
-                    <w:pStyle w:val="Compact"/>
-                    <w:jc w:val="center"/>
-                  </w:pPr>
-                  <m:oMath>
-                    <m:r>
-                      <m:rPr>
-                        <m:sty m:val="p"/>
-                      </m:rPr>
-                      <m:t>log</m:t>
-                    </m:r>
-                    <m:r>
-                      <m:t>​</m:t>
-                    </m:r>
-                    <m:d>
-                      <m:dPr>
-                        <m:begChr m:val="{"/>
-                        <m:sepChr m:val=""/>
-                        <m:endChr m:val="}"/>
-                        <m:grow/>
-                      </m:dPr>
-                      <m:e>
-                        <m:r>
-                          <m:t>λ</m:t>
-                        </m:r>
-                        <m:r>
-                          <m:rPr>
-                            <m:sty m:val="p"/>
-                          </m:rPr>
-                          <m:t>(</m:t>
-                        </m:r>
-                        <m:r>
-                          <m:t>t</m:t>
-                        </m:r>
-                        <m:r>
-                          <m:rPr>
-                            <m:sty m:val="p"/>
-                          </m:rPr>
-                          <m:t>)</m:t>
-                        </m:r>
-                      </m:e>
-                    </m:d>
-                    <m:r>
-                      <m:t>​</m:t>
-                    </m:r>
-                  </m:oMath>
-                  <w:r>
-                    <w:t xml:space="preserve">​</w:t>
-                  </w:r>
-                </w:p>
+                <w:tbl>
+                  <w:tblPr>
+                    <w:tblStyle w:val="Table"/>
+                    <w:tblW w:type="pct" w:w="5000"/>
+                    <w:tblLayout w:type="fixed"/>
+                    <w:tblLook w:firstRow="1" w:lastRow="0" w:firstColumn="0" w:lastColumn="0" w:noHBand="0" w:noVBand="0" w:val="0020"/>
+                  </w:tblPr>
+                  <w:tblGrid>
+                    <w:gridCol w:w="3832"/>
+                    <w:gridCol w:w="1532"/>
+                    <w:gridCol w:w="2554"/>
+                  </w:tblGrid>
+                  <w:tr>
+                    <w:trPr>
+                      <w:tblHeader w:val="on"/>
+                    </w:trPr>
+                    <w:tc>
+                      <w:tcPr/>
+                      <w:p>
+                        <w:pPr>
+                          <w:pStyle w:val="Compact"/>
+                          <w:jc w:val="left"/>
+                          <w:jc w:val="center"/>
+                        </w:pPr>
+                        <w:r>
+                          <w:t xml:space="preserve">Name</w:t>
+                        </w:r>
+                      </w:p>
+                    </w:tc>
+                    <w:tc>
+                      <w:tcPr/>
+                      <w:p>
+                        <w:pPr>
+                          <w:pStyle w:val="Compact"/>
+                          <w:jc w:val="center"/>
+                        </w:pPr>
+                        <w:r>
+                          <w:t xml:space="preserve">Symbols</w:t>
+                        </w:r>
+                      </w:p>
+                    </w:tc>
+                    <w:tc>
+                      <w:tcPr/>
+                      <w:p>
+                        <w:pPr>
+                          <w:pStyle w:val="Compact"/>
+                          <w:jc w:val="center"/>
+                        </w:pPr>
+                        <w:r>
+                          <w:t xml:space="preserve">Definition</w:t>
+                        </w:r>
+                      </w:p>
+                    </w:tc>
+                  </w:tr>
+                  <w:tr>
+                    <w:tc>
+                      <w:tcPr/>
+                      <w:p>
+                        <w:pPr>
+                          <w:pStyle w:val="Compact"/>
+                          <w:jc w:val="left"/>
+                          <w:jc w:val="center"/>
+                        </w:pPr>
+                        <w:hyperlink r:id="rId151">
+                          <w:r>
+                            <w:rPr>
+                              <w:rStyle w:val="Hyperlink"/>
+                            </w:rPr>
+                            <w:t xml:space="preserve">Probability density function (PDF)</w:t>
+                          </w:r>
+                        </w:hyperlink>
+                      </w:p>
+                    </w:tc>
+                    <w:tc>
+                      <w:tcPr/>
+                      <w:p>
+                        <w:pPr>
+                          <w:pStyle w:val="Compact"/>
+                          <w:jc w:val="center"/>
+                        </w:pPr>
+                        <m:oMath>
+                          <m:r>
+                            <m:rPr>
+                              <m:sty m:val="p"/>
+                            </m:rPr>
+                            <m:t>f</m:t>
+                          </m:r>
+                          <m:r>
+                            <m:rPr>
+                              <m:sty m:val="p"/>
+                            </m:rPr>
+                            <m:t>(</m:t>
+                          </m:r>
+                          <m:r>
+                            <m:t>t</m:t>
+                          </m:r>
+                          <m:r>
+                            <m:rPr>
+                              <m:sty m:val="p"/>
+                            </m:rPr>
+                            <m:t>)</m:t>
+                          </m:r>
+                          <m:r>
+                            <m:rPr>
+                              <m:sty m:val="p"/>
+                            </m:rPr>
+                            <m:t>,</m:t>
+                          </m:r>
+                          <m:r>
+                            <m:rPr>
+                              <m:sty m:val="p"/>
+                            </m:rPr>
+                            <m:t>p</m:t>
+                          </m:r>
+                          <m:r>
+                            <m:rPr>
+                              <m:sty m:val="p"/>
+                            </m:rPr>
+                            <m:t>(</m:t>
+                          </m:r>
+                          <m:r>
+                            <m:t>t</m:t>
+                          </m:r>
+                          <m:r>
+                            <m:rPr>
+                              <m:sty m:val="p"/>
+                            </m:rPr>
+                            <m:t>)</m:t>
+                          </m:r>
+                        </m:oMath>
+                        <w:r>
+                          <w:t xml:space="preserve">​</w:t>
+                        </w:r>
+                      </w:p>
+                    </w:tc>
+                    <w:tc>
+                      <w:tcPr/>
+                      <w:p>
+                        <w:pPr>
+                          <w:pStyle w:val="Compact"/>
+                          <w:jc w:val="center"/>
+                        </w:pPr>
+                        <m:oMath>
+                          <m:r>
+                            <m:rPr>
+                              <m:sty m:val="p"/>
+                            </m:rPr>
+                            <m:t>p</m:t>
+                          </m:r>
+                          <m:r>
+                            <m:rPr>
+                              <m:sty m:val="p"/>
+                            </m:rPr>
+                            <m:t>(</m:t>
+                          </m:r>
+                          <m:r>
+                            <m:t>T</m:t>
+                          </m:r>
+                          <m:r>
+                            <m:rPr>
+                              <m:sty m:val="p"/>
+                            </m:rPr>
+                            <m:t>=</m:t>
+                          </m:r>
+                          <m:r>
+                            <m:t>t</m:t>
+                          </m:r>
+                          <m:r>
+                            <m:rPr>
+                              <m:sty m:val="p"/>
+                            </m:rPr>
+                            <m:t>)</m:t>
+                          </m:r>
+                        </m:oMath>
+                        <w:r>
+                          <w:t xml:space="preserve">​</w:t>
+                        </w:r>
+                      </w:p>
+                    </w:tc>
+                  </w:tr>
+                  <w:tr>
+                    <w:tc>
+                      <w:tcPr/>
+                      <w:p>
+                        <w:pPr>
+                          <w:pStyle w:val="Compact"/>
+                          <w:jc w:val="left"/>
+                          <w:jc w:val="center"/>
+                        </w:pPr>
+                        <w:hyperlink r:id="rId152">
+                          <w:r>
+                            <w:rPr>
+                              <w:rStyle w:val="Hyperlink"/>
+                            </w:rPr>
+                            <w:t xml:space="preserve">Cumulative distribution function (CDF)</w:t>
+                          </w:r>
+                        </w:hyperlink>
+                      </w:p>
+                    </w:tc>
+                    <w:tc>
+                      <w:tcPr/>
+                      <w:p>
+                        <w:pPr>
+                          <w:pStyle w:val="Compact"/>
+                          <w:jc w:val="center"/>
+                        </w:pPr>
+                        <m:oMath>
+                          <m:r>
+                            <m:rPr>
+                              <m:sty m:val="p"/>
+                            </m:rPr>
+                            <m:t>F</m:t>
+                          </m:r>
+                          <m:r>
+                            <m:rPr>
+                              <m:sty m:val="p"/>
+                            </m:rPr>
+                            <m:t>(</m:t>
+                          </m:r>
+                          <m:r>
+                            <m:t>t</m:t>
+                          </m:r>
+                          <m:r>
+                            <m:rPr>
+                              <m:sty m:val="p"/>
+                            </m:rPr>
+                            <m:t>)</m:t>
+                          </m:r>
+                          <m:r>
+                            <m:rPr>
+                              <m:sty m:val="p"/>
+                            </m:rPr>
+                            <m:t>,</m:t>
+                          </m:r>
+                          <m:r>
+                            <m:rPr>
+                              <m:sty m:val="p"/>
+                            </m:rPr>
+                            <m:t>P</m:t>
+                          </m:r>
+                          <m:r>
+                            <m:rPr>
+                              <m:sty m:val="p"/>
+                            </m:rPr>
+                            <m:t>(</m:t>
+                          </m:r>
+                          <m:r>
+                            <m:t>t</m:t>
+                          </m:r>
+                          <m:r>
+                            <m:rPr>
+                              <m:sty m:val="p"/>
+                            </m:rPr>
+                            <m:t>)</m:t>
+                          </m:r>
+                        </m:oMath>
+                        <w:r>
+                          <w:t xml:space="preserve">​</w:t>
+                        </w:r>
+                      </w:p>
+                    </w:tc>
+                    <w:tc>
+                      <w:tcPr/>
+                      <w:p>
+                        <w:pPr>
+                          <w:pStyle w:val="Compact"/>
+                          <w:jc w:val="center"/>
+                        </w:pPr>
+                        <m:oMath>
+                          <m:r>
+                            <m:rPr>
+                              <m:sty m:val="p"/>
+                            </m:rPr>
+                            <m:t>P</m:t>
+                          </m:r>
+                          <m:r>
+                            <m:rPr>
+                              <m:sty m:val="p"/>
+                            </m:rPr>
+                            <m:t>(</m:t>
+                          </m:r>
+                          <m:r>
+                            <m:t>T</m:t>
+                          </m:r>
+                          <m:r>
+                            <m:rPr>
+                              <m:sty m:val="p"/>
+                            </m:rPr>
+                            <m:t>≤</m:t>
+                          </m:r>
+                          <m:r>
+                            <m:t>t</m:t>
+                          </m:r>
+                          <m:r>
+                            <m:rPr>
+                              <m:sty m:val="p"/>
+                            </m:rPr>
+                            <m:t>)</m:t>
+                          </m:r>
+                        </m:oMath>
+                        <w:r>
+                          <w:t xml:space="preserve">​</w:t>
+                        </w:r>
+                      </w:p>
+                    </w:tc>
+                  </w:tr>
+                  <w:tr>
+                    <w:tc>
+                      <w:tcPr/>
+                      <w:p>
+                        <w:pPr>
+                          <w:pStyle w:val="Compact"/>
+                          <w:jc w:val="left"/>
+                          <w:jc w:val="center"/>
+                        </w:pPr>
+                        <w:hyperlink r:id="rId153">
+                          <w:r>
+                            <w:rPr>
+                              <w:rStyle w:val="Hyperlink"/>
+                            </w:rPr>
+                            <w:t xml:space="preserve">Survival function</w:t>
+                          </w:r>
+                        </w:hyperlink>
+                      </w:p>
+                    </w:tc>
+                    <w:tc>
+                      <w:tcPr/>
+                      <w:p>
+                        <w:pPr>
+                          <w:pStyle w:val="Compact"/>
+                          <w:jc w:val="center"/>
+                        </w:pPr>
+                        <m:oMath>
+                          <m:r>
+                            <m:rPr>
+                              <m:sty m:val="p"/>
+                            </m:rPr>
+                            <m:t>S</m:t>
+                          </m:r>
+                          <m:r>
+                            <m:rPr>
+                              <m:sty m:val="p"/>
+                            </m:rPr>
+                            <m:t>(</m:t>
+                          </m:r>
+                          <m:r>
+                            <m:t>t</m:t>
+                          </m:r>
+                          <m:r>
+                            <m:rPr>
+                              <m:sty m:val="p"/>
+                            </m:rPr>
+                            <m:t>)</m:t>
+                          </m:r>
+                          <m:r>
+                            <m:rPr>
+                              <m:sty m:val="p"/>
+                            </m:rPr>
+                            <m:t>,</m:t>
+                          </m:r>
+                          <m:acc>
+                            <m:accPr>
+                              <m:chr m:val="‾"/>
+                            </m:accPr>
+                            <m:e>
+                              <m:r>
+                                <m:rPr>
+                                  <m:sty m:val="p"/>
+                                </m:rPr>
+                                <m:t>F</m:t>
+                              </m:r>
+                            </m:e>
+                          </m:acc>
+                          <m:r>
+                            <m:rPr>
+                              <m:sty m:val="p"/>
+                            </m:rPr>
+                            <m:t>(</m:t>
+                          </m:r>
+                          <m:r>
+                            <m:t>t</m:t>
+                          </m:r>
+                          <m:r>
+                            <m:rPr>
+                              <m:sty m:val="p"/>
+                            </m:rPr>
+                            <m:t>)</m:t>
+                          </m:r>
+                        </m:oMath>
+                        <w:r>
+                          <w:t xml:space="preserve">​</w:t>
+                        </w:r>
+                      </w:p>
+                    </w:tc>
+                    <w:tc>
+                      <w:tcPr/>
+                      <w:p>
+                        <w:pPr>
+                          <w:pStyle w:val="Compact"/>
+                          <w:jc w:val="center"/>
+                        </w:pPr>
+                        <m:oMath>
+                          <m:r>
+                            <m:rPr>
+                              <m:sty m:val="p"/>
+                            </m:rPr>
+                            <m:t>P</m:t>
+                          </m:r>
+                          <m:r>
+                            <m:rPr>
+                              <m:sty m:val="p"/>
+                            </m:rPr>
+                            <m:t>(</m:t>
+                          </m:r>
+                          <m:r>
+                            <m:t>T</m:t>
+                          </m:r>
+                          <m:r>
+                            <m:rPr>
+                              <m:sty m:val="p"/>
+                            </m:rPr>
+                            <m:t>&gt;</m:t>
+                          </m:r>
+                          <m:r>
+                            <m:t>t</m:t>
+                          </m:r>
+                          <m:r>
+                            <m:rPr>
+                              <m:sty m:val="p"/>
+                            </m:rPr>
+                            <m:t>)</m:t>
+                          </m:r>
+                        </m:oMath>
+                        <w:r>
+                          <w:t xml:space="preserve">​</w:t>
+                        </w:r>
+                      </w:p>
+                    </w:tc>
+                  </w:tr>
+                  <w:tr>
+                    <w:tc>
+                      <w:tcPr/>
+                      <w:p>
+                        <w:pPr>
+                          <w:pStyle w:val="Compact"/>
+                          <w:jc w:val="left"/>
+                          <w:jc w:val="center"/>
+                        </w:pPr>
+                        <w:hyperlink r:id="rId154">
+                          <w:r>
+                            <w:rPr>
+                              <w:rStyle w:val="Hyperlink"/>
+                            </w:rPr>
+                            <w:t xml:space="preserve">Hazard function</w:t>
+                          </w:r>
+                        </w:hyperlink>
+                      </w:p>
+                    </w:tc>
+                    <w:tc>
+                      <w:tcPr/>
+                      <w:p>
+                        <w:pPr>
+                          <w:pStyle w:val="Compact"/>
+                          <w:jc w:val="center"/>
+                        </w:pPr>
+                        <m:oMath>
+                          <m:r>
+                            <m:t>λ</m:t>
+                          </m:r>
+                          <m:r>
+                            <m:rPr>
+                              <m:sty m:val="p"/>
+                            </m:rPr>
+                            <m:t>(</m:t>
+                          </m:r>
+                          <m:r>
+                            <m:t>t</m:t>
+                          </m:r>
+                          <m:r>
+                            <m:rPr>
+                              <m:sty m:val="p"/>
+                            </m:rPr>
+                            <m:t>)</m:t>
+                          </m:r>
+                          <m:r>
+                            <m:rPr>
+                              <m:sty m:val="p"/>
+                            </m:rPr>
+                            <m:t>,</m:t>
+                          </m:r>
+                          <m:r>
+                            <m:rPr>
+                              <m:sty m:val="p"/>
+                            </m:rPr>
+                            <m:t>h</m:t>
+                          </m:r>
+                          <m:r>
+                            <m:rPr>
+                              <m:sty m:val="p"/>
+                            </m:rPr>
+                            <m:t>(</m:t>
+                          </m:r>
+                          <m:r>
+                            <m:t>t</m:t>
+                          </m:r>
+                          <m:r>
+                            <m:rPr>
+                              <m:sty m:val="p"/>
+                            </m:rPr>
+                            <m:t>)</m:t>
+                          </m:r>
+                        </m:oMath>
+                        <w:r>
+                          <w:t xml:space="preserve">​</w:t>
+                        </w:r>
+                      </w:p>
+                    </w:tc>
+                    <w:tc>
+                      <w:tcPr/>
+                      <w:p>
+                        <w:pPr>
+                          <w:pStyle w:val="Compact"/>
+                          <w:jc w:val="center"/>
+                        </w:pPr>
+                        <m:oMath>
+                          <m:r>
+                            <m:rPr>
+                              <m:sty m:val="p"/>
+                            </m:rPr>
+                            <m:t>p</m:t>
+                          </m:r>
+                          <m:r>
+                            <m:rPr>
+                              <m:sty m:val="p"/>
+                            </m:rPr>
+                            <m:t>(</m:t>
+                          </m:r>
+                          <m:r>
+                            <m:t>T</m:t>
+                          </m:r>
+                          <m:r>
+                            <m:rPr>
+                              <m:sty m:val="p"/>
+                            </m:rPr>
+                            <m:t>=</m:t>
+                          </m:r>
+                          <m:r>
+                            <m:t>t</m:t>
+                          </m:r>
+                          <m:r>
+                            <m:rPr>
+                              <m:sty m:val="p"/>
+                            </m:rPr>
+                            <m:t>|</m:t>
+                          </m:r>
+                          <m:r>
+                            <m:t>T</m:t>
+                          </m:r>
+                          <m:r>
+                            <m:rPr>
+                              <m:sty m:val="p"/>
+                            </m:rPr>
+                            <m:t>≥</m:t>
+                          </m:r>
+                          <m:r>
+                            <m:t>t</m:t>
+                          </m:r>
+                          <m:r>
+                            <m:rPr>
+                              <m:sty m:val="p"/>
+                            </m:rPr>
+                            <m:t>)</m:t>
+                          </m:r>
+                        </m:oMath>
+                        <w:r>
+                          <w:t xml:space="preserve">​</w:t>
+                        </w:r>
+                      </w:p>
+                    </w:tc>
+                  </w:tr>
+                  <w:tr>
+                    <w:tc>
+                      <w:tcPr/>
+                      <w:p>
+                        <w:pPr>
+                          <w:pStyle w:val="Compact"/>
+                          <w:jc w:val="left"/>
+                          <w:jc w:val="center"/>
+                        </w:pPr>
+                        <w:hyperlink r:id="rId155">
+                          <w:r>
+                            <w:rPr>
+                              <w:rStyle w:val="Hyperlink"/>
+                            </w:rPr>
+                            <w:t xml:space="preserve">Cumulative hazard function</w:t>
+                          </w:r>
+                        </w:hyperlink>
+                      </w:p>
+                    </w:tc>
+                    <w:tc>
+                      <w:tcPr/>
+                      <w:p>
+                        <w:pPr>
+                          <w:pStyle w:val="Compact"/>
+                          <w:jc w:val="center"/>
+                        </w:pPr>
+                        <m:oMath>
+                          <m:r>
+                            <m:rPr>
+                              <m:sty m:val="p"/>
+                            </m:rPr>
+                            <m:t>Λ</m:t>
+                          </m:r>
+                          <m:r>
+                            <m:rPr>
+                              <m:sty m:val="p"/>
+                            </m:rPr>
+                            <m:t>(</m:t>
+                          </m:r>
+                          <m:r>
+                            <m:t>t</m:t>
+                          </m:r>
+                          <m:r>
+                            <m:rPr>
+                              <m:sty m:val="p"/>
+                            </m:rPr>
+                            <m:t>)</m:t>
+                          </m:r>
+                          <m:r>
+                            <m:rPr>
+                              <m:sty m:val="p"/>
+                            </m:rPr>
+                            <m:t>,</m:t>
+                          </m:r>
+                          <m:r>
+                            <m:rPr>
+                              <m:sty m:val="p"/>
+                            </m:rPr>
+                            <m:t>H</m:t>
+                          </m:r>
+                          <m:r>
+                            <m:rPr>
+                              <m:sty m:val="p"/>
+                            </m:rPr>
+                            <m:t>(</m:t>
+                          </m:r>
+                          <m:r>
+                            <m:t>t</m:t>
+                          </m:r>
+                          <m:r>
+                            <m:rPr>
+                              <m:sty m:val="p"/>
+                            </m:rPr>
+                            <m:t>)</m:t>
+                          </m:r>
+                        </m:oMath>
+                        <w:r>
+                          <w:t xml:space="preserve">​</w:t>
+                        </w:r>
+                      </w:p>
+                    </w:tc>
+                    <w:tc>
+                      <w:tcPr/>
+                      <w:p>
+                        <w:pPr>
+                          <w:pStyle w:val="Compact"/>
+                          <w:jc w:val="center"/>
+                        </w:pPr>
+                        <m:oMath>
+                          <m:nary>
+                            <m:naryPr>
+                              <m:chr m:val="∫"/>
+                              <m:limLoc m:val="subSup"/>
+                              <m:subHide m:val="off"/>
+                              <m:supHide m:val="off"/>
+                            </m:naryPr>
+                            <m:sub>
+                              <m:r>
+                                <m:t>u</m:t>
+                              </m:r>
+                              <m:r>
+                                <m:rPr>
+                                  <m:sty m:val="p"/>
+                                </m:rPr>
+                                <m:t>=</m:t>
+                              </m:r>
+                              <m:r>
+                                <m:rPr>
+                                  <m:sty m:val="p"/>
+                                </m:rPr>
+                                <m:t>−</m:t>
+                              </m:r>
+                              <m:r>
+                                <m:rPr>
+                                  <m:sty m:val="p"/>
+                                </m:rPr>
+                                <m:t>∞</m:t>
+                              </m:r>
+                            </m:sub>
+                            <m:sup>
+                              <m:r>
+                                <m:t>t</m:t>
+                              </m:r>
+                            </m:sup>
+                            <m:e>
+                              <m:r>
+                                <m:t>λ</m:t>
+                              </m:r>
+                            </m:e>
+                          </m:nary>
+                          <m:r>
+                            <m:rPr>
+                              <m:sty m:val="p"/>
+                            </m:rPr>
+                            <m:t>(</m:t>
+                          </m:r>
+                          <m:r>
+                            <m:t>u</m:t>
+                          </m:r>
+                          <m:r>
+                            <m:rPr>
+                              <m:sty m:val="p"/>
+                            </m:rPr>
+                            <m:t>)</m:t>
+                          </m:r>
+                          <m:r>
+                            <m:t>d</m:t>
+                          </m:r>
+                          <m:r>
+                            <m:t>u</m:t>
+                          </m:r>
+                        </m:oMath>
+                        <w:r>
+                          <w:t xml:space="preserve">​</w:t>
+                        </w:r>
+                      </w:p>
+                    </w:tc>
+                  </w:tr>
+                  <w:tr>
+                    <w:tc>
+                      <w:tcPr/>
+                      <w:p>
+                        <w:pPr>
+                          <w:pStyle w:val="Compact"/>
+                          <w:jc w:val="left"/>
+                          <w:jc w:val="center"/>
+                        </w:pPr>
+                        <w:hyperlink r:id="rId156">
+                          <w:r>
+                            <w:rPr>
+                              <w:rStyle w:val="Hyperlink"/>
+                            </w:rPr>
+                            <w:t xml:space="preserve">Log-hazard function</w:t>
+                          </w:r>
+                        </w:hyperlink>
+                      </w:p>
+                    </w:tc>
+                    <w:tc>
+                      <w:tcPr/>
+                      <w:p>
+                        <w:pPr>
+                          <w:pStyle w:val="Compact"/>
+                          <w:jc w:val="center"/>
+                        </w:pPr>
+                        <m:oMath>
+                          <m:r>
+                            <m:t>η</m:t>
+                          </m:r>
+                          <m:r>
+                            <m:rPr>
+                              <m:sty m:val="p"/>
+                            </m:rPr>
+                            <m:t>(</m:t>
+                          </m:r>
+                          <m:r>
+                            <m:t>t</m:t>
+                          </m:r>
+                          <m:r>
+                            <m:rPr>
+                              <m:sty m:val="p"/>
+                            </m:rPr>
+                            <m:t>)</m:t>
+                          </m:r>
+                        </m:oMath>
+                        <w:r>
+                          <w:t xml:space="preserve">​</w:t>
+                        </w:r>
+                      </w:p>
+                    </w:tc>
+                    <w:tc>
+                      <w:tcPr/>
+                      <w:p>
+                        <w:pPr>
+                          <w:pStyle w:val="Compact"/>
+                          <w:jc w:val="center"/>
+                        </w:pPr>
+                        <m:oMath>
+                          <m:r>
+                            <m:rPr>
+                              <m:sty m:val="p"/>
+                            </m:rPr>
+                            <m:t>log</m:t>
+                          </m:r>
+                          <m:r>
+                            <m:t>​</m:t>
+                          </m:r>
+                          <m:d>
+                            <m:dPr>
+                              <m:begChr m:val="{"/>
+                              <m:sepChr m:val=""/>
+                              <m:endChr m:val="}"/>
+                              <m:grow/>
+                            </m:dPr>
+                            <m:e>
+                              <m:r>
+                                <m:t>λ</m:t>
+                              </m:r>
+                              <m:r>
+                                <m:rPr>
+                                  <m:sty m:val="p"/>
+                                </m:rPr>
+                                <m:t>(</m:t>
+                              </m:r>
+                              <m:r>
+                                <m:t>t</m:t>
+                              </m:r>
+                              <m:r>
+                                <m:rPr>
+                                  <m:sty m:val="p"/>
+                                </m:rPr>
+                                <m:t>)</m:t>
+                              </m:r>
+                            </m:e>
+                          </m:d>
+                          <m:r>
+                            <m:t>​</m:t>
+                          </m:r>
+                        </m:oMath>
+                        <w:r>
+                          <w:t xml:space="preserve">​</w:t>
+                        </w:r>
+                      </w:p>
+                    </w:tc>
+                  </w:tr>
+                </w:tbl>
+                <w:bookmarkEnd w:id="157"/>
+                <w:p/>
               </w:tc>
             </w:tr>
           </w:tbl>
-          <w:bookmarkEnd w:id="157"/>
-          <w:p/>
         </w:tc>
       </w:tr>
     </w:tbl>
@@ -20792,29 +20866,27 @@
     <w:tbl>
       <w:tblPr>
         <w:tblStyle w:val="Table"/>
-        <w:tblLook w:firstRow="0" w:lastRow="0" w:firstColumn="0" w:lastColumn="0" w:noHBand="0" w:noVBand="0" w:val="0000"/>
+        <w:tblInd w:w="164" w:type="dxa"/>
         <w:tblBorders>
-          <w:top w:val="single" w:sz="4" w:space="0" w:color="909090"/>
           <w:left w:val="single" w:sz="24" w:space="0" w:color="909090"/>
-          <w:bottom w:val="single" w:sz="4" w:space="0" w:color="909090"/>
-          <w:right w:val="single" w:sz="4" w:space="0" w:color="909090"/>
         </w:tblBorders>
         <w:tblCellMar>
-          <w:left w:w="144" w:type="dxa"/>
-          <w:right w:w="144" w:type="dxa"/>
+          <w:left w:w="0" w:type="dxa"/>
+          <w:right w:w="0" w:type="dxa"/>
         </w:tblCellMar>
         <w:tblLook w:firstRow="0" w:lastRow="0" w:firstColumn="0" w:lastColumn="0" w:noHBand="0" w:noVBand="0" w:val="0000"/>
       </w:tblPr>
+      <w:tblGrid>
+        <w:gridCol w:w="7920"/>
+      </w:tblGrid>
       <w:tr>
         <w:trPr>
           <w:cantSplit/>
         </w:trPr>
         <w:tc>
           <w:tcPr>
-            <w:shd w:color="auto" w:fill="e6e6e6" w:val="clear"/>
             <w:tcMar>
-              <w:top w:w="92" w:type="dxa"/>
-              <w:bottom w:w="92" w:type="dxa"/>
+              <w:left w:w="144" w:type="dxa"/>
             </w:tcMar>
           </w:tcPr>
           <w:p>
@@ -20822,25 +20894,9 @@
               <w:pStyle w:val="BodyText"/>
             </w:pPr>
             <w:pPr>
-              <w:spacing w:before="16" w:after="16"/>
+              <w:spacing w:before="16" w:after="64"/>
             </w:pPr>
-            <w:r>
-              <w:t xml:space="preserve">Exm</w:t>
-            </w:r>
           </w:p>
-        </w:tc>
-      </w:tr>
-      <w:tr>
-        <w:trPr>
-          <w:cantSplit/>
-        </w:trPr>
-        <w:tc>
-          <w:tcPr>
-            <w:tcMar>
-              <w:top w:w="108" w:type="dxa"/>
-              <w:bottom w:w="108" w:type="dxa"/>
-            </w:tcMar>
-          </w:tcPr>
           <w:bookmarkStart w:id="174" w:name="exm-breslow-baseline-cuhaz-est"/>
           <w:p>
             <w:pPr>
@@ -21111,7 +21167,6 @@
             </m:oMathPara>
           </w:p>
           <w:bookmarkEnd w:id="174"/>
-          <w:p/>
         </w:tc>
       </w:tr>
     </w:tbl>

</xml_diff>